<commit_message>
docs: describe one open alert per gondola in CU02 (#42)
</commit_message>
<xml_diff>
--- a/Anexos/Diseño/Plantilla de C.U 02.docx
+++ b/Anexos/Diseño/Plantilla de C.U 02.docx
@@ -591,7 +591,7 @@
                 <w:color w:val="1f1f1f"/>
                 <w:rtl w:val="0"/>
               </w:rPr>
-              <w:t xml:space="preserve">El sistema muestra la alerta en la vista de alertas del Dashboard Web, accesible desde el teléfono del reponedor.</w:t>
+              <w:t xml:space="preserve">El sistema muestra la alerta en la página "Alertas" de la app web, pensada para el teléfono del reponedor (la ven los tres perfiles), que se recarga sola cada minuto. La notificación push al teléfono queda pendiente.</w:t>
             </w:r>
           </w:p>
           <w:p>
@@ -637,7 +637,7 @@
                 <w:color w:val="1f1f1f"/>
                 <w:rtl w:val="0"/>
               </w:rPr>
-              <w:t xml:space="preserve">El reponedor marca la alerta como "En Proceso" o "Completada". La siguiente captura de la góndola confirma la reposición: si el espacio libre sigue sobre el umbral, la alerta se reabre.</w:t>
+              <w:t xml:space="preserve">El reponedor toma la alerta ("En proceso") y, al reponer, la marca "Completada". La siguiente foto de la góndola confirma la reposición: sin quiebre, cierra la alerta abierta; con quiebre, la alerta sigue abierta (o se abre una nueva si ya estaba completada).</w:t>
             </w:r>
           </w:p>
         </w:tc>
@@ -799,7 +799,7 @@
                 <w:color w:val="1f1f1f"/>
                 <w:rtl w:val="0"/>
               </w:rPr>
-              <w:t xml:space="preserve">: Si ya existe una alerta activa para la misma góndola en un intervalo menor a 15 minutos, el sistema consolida la notificación para evitar saturación.</w:t>
+              <w:t xml:space="preserve">: Una góndola tiene a lo más una alerta abierta. Si llega una foto con quiebre y la góndola ya tiene una alerta abierta (Activa o En proceso), la foto nueva reemplaza a la anterior y conserva su estado y quién la atiende, para no duplicar alertas.</w:t>
             </w:r>
             <w:r>
               <w:rPr>

</xml_diff>